<commit_message>
addition of two columns named quotationno and date in the quotation table
</commit_message>
<xml_diff>
--- a/QuotationApp.API/Templates/QuotationTemplate.docx
+++ b/QuotationApp.API/Templates/QuotationTemplate.docx
@@ -95,6 +95,48 @@
           <w:color w:val="2E7D6B"/>
         </w:rPr>
         <w:t xml:space="preserve">{{CONTACT_EMAIL}}</w:t>
+      </w:r>
+    </w:p>
+    <w:p>
+      <w:pPr>
+        <w:spacing w:after="120"/>
+      </w:pPr>
+      <w:r>
+        <w:rPr>
+          <w:b/>
+          <w:bCs/>
+          <w:color w:val="1B2A4E"/>
+        </w:rPr>
+        <w:t xml:space="preserve">Quotation No.: </w:t>
+      </w:r>
+      <w:r>
+        <w:rPr>
+          <w:b/>
+          <w:bCs/>
+          <w:color w:val="2E7D6B"/>
+        </w:rPr>
+        <w:t xml:space="preserve">{{QUOTATION_NO}}</w:t>
+      </w:r>
+    </w:p>
+    <w:p>
+      <w:pPr>
+        <w:spacing w:after="120"/>
+      </w:pPr>
+      <w:r>
+        <w:rPr>
+          <w:b/>
+          <w:bCs/>
+          <w:color w:val="1B2A4E"/>
+        </w:rPr>
+        <w:t xml:space="preserve">Date: </w:t>
+      </w:r>
+      <w:r>
+        <w:rPr>
+          <w:b/>
+          <w:bCs/>
+          <w:color w:val="2E7D6B"/>
+        </w:rPr>
+        <w:t xml:space="preserve">{{DATE}}</w:t>
       </w:r>
     </w:p>
     <w:p>

</xml_diff>

<commit_message>
update in the quotationpdfview page for showing the Price for Implementation table for discountpercentage
</commit_message>
<xml_diff>
--- a/QuotationApp.API/Templates/QuotationTemplate.docx
+++ b/QuotationApp.API/Templates/QuotationTemplate.docx
@@ -10,7 +10,7 @@
         <w:rPr>
           <w:b/>
           <w:bCs/>
-          <w:color w:val="65AADB"/>
+          <w:color w:val="1B2A4E"/>
         </w:rPr>
         <w:t xml:space="preserve">QUOTATION TO</w:t>
       </w:r>
@@ -23,7 +23,7 @@
         <w:rPr>
           <w:b/>
           <w:bCs/>
-          <w:color w:val="65AADB"/>
+          <w:color w:val="1B2A4E"/>
         </w:rPr>
         <w:t xml:space="preserve">Name: </w:t>
       </w:r>
@@ -31,7 +31,7 @@
         <w:rPr>
           <w:b/>
           <w:bCs/>
-          <w:color w:val="65AADB"/>
+          <w:color w:val="2E7D6B"/>
         </w:rPr>
         <w:t xml:space="preserve">{{CONTACT_NAME}}</w:t>
       </w:r>
@@ -44,7 +44,7 @@
         <w:rPr>
           <w:b/>
           <w:bCs/>
-          <w:color w:val="65AADB"/>
+          <w:color w:val="1B2A4E"/>
         </w:rPr>
         <w:t xml:space="preserve">Address: </w:t>
       </w:r>
@@ -52,7 +52,7 @@
         <w:rPr>
           <w:b/>
           <w:bCs/>
-          <w:color w:val="65AADB"/>
+          <w:color w:val="2E7D6B"/>
         </w:rPr>
         <w:t xml:space="preserve">{{CONTACT_ADDRESS}}</w:t>
       </w:r>
@@ -65,7 +65,7 @@
         <w:rPr>
           <w:b/>
           <w:bCs/>
-          <w:color w:val="65AADB"/>
+          <w:color w:val="1B2A4E"/>
         </w:rPr>
         <w:t xml:space="preserve">Contact No.: </w:t>
       </w:r>
@@ -73,7 +73,7 @@
         <w:rPr>
           <w:b/>
           <w:bCs/>
-          <w:color w:val="65AADB"/>
+          <w:color w:val="2E7D6B"/>
         </w:rPr>
         <w:t xml:space="preserve">{{CONTACT_PHONE}}</w:t>
       </w:r>
@@ -84,7 +84,7 @@
         <w:rPr>
           <w:b/>
           <w:bCs/>
-          <w:color w:val="65AADB"/>
+          <w:color w:val="1B2A4E"/>
         </w:rPr>
         <w:t xml:space="preserve">Email: </w:t>
       </w:r>
@@ -92,62 +92,20 @@
         <w:rPr>
           <w:b/>
           <w:bCs/>
-          <w:color w:val="65AADB"/>
+          <w:color w:val="2E7D6B"/>
         </w:rPr>
         <w:t xml:space="preserve">{{CONTACT_EMAIL}}</w:t>
       </w:r>
     </w:p>
     <w:p>
       <w:pPr>
-        <w:spacing w:after="120"/>
-      </w:pPr>
-      <w:r>
-        <w:rPr>
-          <w:b/>
-          <w:bCs/>
-          <w:color w:val="65AADB"/>
-        </w:rPr>
-        <w:t xml:space="preserve">Quotation No.: </w:t>
-      </w:r>
-      <w:r>
-        <w:rPr>
-          <w:b/>
-          <w:bCs/>
-          <w:color w:val="65AADB"/>
-        </w:rPr>
-        <w:t xml:space="preserve">{{QUOTATION_NO}}</w:t>
-      </w:r>
-    </w:p>
-    <w:p>
-      <w:pPr>
-        <w:spacing w:after="120"/>
-      </w:pPr>
-      <w:r>
-        <w:rPr>
-          <w:b/>
-          <w:bCs/>
-          <w:color w:val="65AADB"/>
-        </w:rPr>
-        <w:t xml:space="preserve">Date: </w:t>
-      </w:r>
-      <w:r>
-        <w:rPr>
-          <w:b/>
-          <w:bCs/>
-          <w:color w:val="65AADB"/>
-        </w:rPr>
-        <w:t xml:space="preserve">{{DATE}}</w:t>
-      </w:r>
-    </w:p>
-    <w:p>
-      <w:pPr>
         <w:spacing w:after="80"/>
       </w:pPr>
       <w:r>
         <w:rPr>
           <w:b/>
           <w:bCs/>
-          <w:color w:val="65AADB"/>
+          <w:color w:val="1B2A4E"/>
         </w:rPr>
         <w:t xml:space="preserve">Reference: </w:t>
       </w:r>
@@ -158,7 +116,7 @@
         <w:rPr>
           <w:b/>
           <w:bCs/>
-          <w:color w:val="65AADB"/>
+          <w:color w:val="2E7D6B"/>
         </w:rPr>
         <w:t xml:space="preserve">{{MODULE_LIST}}</w:t>
       </w:r>
@@ -174,7 +132,7 @@
         <w:rPr>
           <w:b/>
           <w:bCs/>
-          <w:color w:val="65AADB"/>
+          <w:color w:val="1B2A4E"/>
         </w:rPr>
         <w:t xml:space="preserve">Subject: </w:t>
       </w:r>
@@ -185,7 +143,7 @@
         <w:rPr>
           <w:b/>
           <w:bCs/>
-          <w:color w:val="65AADB"/>
+          <w:color w:val="2E7D6B"/>
         </w:rPr>
         <w:t xml:space="preserve">{{MODULE_LIST}}</w:t>
       </w:r>
@@ -220,7 +178,7 @@
         <w:rPr>
           <w:b/>
           <w:bCs/>
-          <w:color w:val="65AADB"/>
+          <w:color w:val="2E7D6B"/>
         </w:rPr>
         <w:t xml:space="preserve">{{ORG_NAME}}</w:t>
       </w:r>
@@ -231,7 +189,7 @@
     <w:p>
       <w:pPr>
         <w:pBdr>
-          <w:bottom w:val="single" w:color="65AADB" w:sz="6" w:space="4"/>
+          <w:bottom w:val="single" w:color="2E7D6B" w:sz="6" w:space="4"/>
         </w:pBdr>
         <w:spacing w:after="150" w:before="300"/>
       </w:pPr>
@@ -240,7 +198,7 @@
           <w:b/>
           <w:bCs/>
           <w:caps/>
-          <w:color w:val="65AADB"/>
+          <w:color w:val="1B2A4E"/>
           <w:sz w:val="26"/>
           <w:szCs w:val="26"/>
         </w:rPr>
@@ -258,7 +216,7 @@
         <w:rPr>
           <w:b/>
           <w:bCs/>
-          <w:color w:val="65AADB"/>
+          <w:color w:val="2E7D6B"/>
         </w:rPr>
         <w:t xml:space="preserve">{{ORG_NAME}}</w:t>
       </w:r>
@@ -277,7 +235,7 @@
         <w:rPr>
           <w:b/>
           <w:bCs/>
-          <w:color w:val="65AADB"/>
+          <w:color w:val="2E7D6B"/>
         </w:rPr>
         <w:t xml:space="preserve">{{MODULE_LIST}}</w:t>
       </w:r>
@@ -288,7 +246,7 @@
     <w:p>
       <w:pPr>
         <w:pBdr>
-          <w:bottom w:val="single" w:color="65AADB" w:sz="6" w:space="4"/>
+          <w:bottom w:val="single" w:color="2E7D6B" w:sz="6" w:space="4"/>
         </w:pBdr>
         <w:spacing w:after="150" w:before="300"/>
       </w:pPr>
@@ -297,7 +255,7 @@
           <w:b/>
           <w:bCs/>
           <w:caps/>
-          <w:color w:val="65AADB"/>
+          <w:color w:val="1B2A4E"/>
           <w:sz w:val="26"/>
           <w:szCs w:val="26"/>
         </w:rPr>
@@ -359,7 +317,7 @@
         <w:rPr>
           <w:b/>
           <w:bCs/>
-          <w:color w:val="65AADB"/>
+          <w:color w:val="2E7D6B"/>
         </w:rPr>
         <w:t xml:space="preserve">{{MODULE_LIST}}</w:t>
       </w:r>
@@ -375,7 +333,7 @@
     <w:p>
       <w:pPr>
         <w:pBdr>
-          <w:bottom w:val="single" w:color="65AADB" w:sz="6" w:space="4"/>
+          <w:bottom w:val="single" w:color="2E7D6B" w:sz="6" w:space="4"/>
         </w:pBdr>
         <w:spacing w:after="150" w:before="300"/>
       </w:pPr>
@@ -384,7 +342,7 @@
           <w:b/>
           <w:bCs/>
           <w:caps/>
-          <w:color w:val="65AADB"/>
+          <w:color w:val="1B2A4E"/>
           <w:sz w:val="26"/>
           <w:szCs w:val="26"/>
         </w:rPr>
@@ -416,7 +374,7 @@
         <w:tc>
           <w:tcPr>
             <w:tcW w:type="dxa" w:w="2200"/>
-            <w:shd w:fill="65AADB" w:color="auto" w:val="clear"/>
+            <w:shd w:fill="1B2A4E" w:color="auto" w:val="clear"/>
             <w:tcMar>
               <w:top w:type="dxa" w:w="80"/>
               <w:left w:type="dxa" w:w="120"/>
@@ -441,7 +399,7 @@
         <w:tc>
           <w:tcPr>
             <w:tcW w:type="dxa" w:w="5200"/>
-            <w:shd w:fill="65AADB" w:color="auto" w:val="clear"/>
+            <w:shd w:fill="1B2A4E" w:color="auto" w:val="clear"/>
             <w:tcMar>
               <w:top w:type="dxa" w:w="80"/>
               <w:left w:type="dxa" w:w="120"/>
@@ -466,7 +424,7 @@
         <w:tc>
           <w:tcPr>
             <w:tcW w:type="dxa" w:w="1600"/>
-            <w:shd w:fill="65AADB" w:color="auto" w:val="clear"/>
+            <w:shd w:fill="1B2A4E" w:color="auto" w:val="clear"/>
             <w:tcMar>
               <w:top w:type="dxa" w:w="80"/>
               <w:left w:type="dxa" w:w="120"/>
@@ -491,7 +449,7 @@
         <w:tc>
           <w:tcPr>
             <w:tcW w:type="dxa" w:w="1"/>
-            <w:shd w:fill="65AADB" w:color="auto" w:val="clear"/>
+            <w:shd w:fill="1B2A4E" w:color="auto" w:val="clear"/>
             <w:tcMar>
               <w:top w:type="dxa" w:w="80"/>
               <w:left w:type="dxa" w:w="120"/>
@@ -573,7 +531,7 @@
               <w:rPr>
                 <w:b/>
                 <w:bCs/>
-                <w:color w:val="65AADB"/>
+                <w:color w:val="2E7D6B"/>
                 <w:sz w:val="20"/>
                 <w:szCs w:val="20"/>
               </w:rPr>
@@ -657,7 +615,7 @@
               <w:rPr>
                 <w:b/>
                 <w:bCs/>
-                <w:color w:val="65AADB"/>
+                <w:color w:val="2E7D6B"/>
                 <w:sz w:val="20"/>
                 <w:szCs w:val="20"/>
               </w:rPr>
@@ -741,7 +699,7 @@
               <w:rPr>
                 <w:b/>
                 <w:bCs/>
-                <w:color w:val="65AADB"/>
+                <w:color w:val="2E7D6B"/>
                 <w:sz w:val="20"/>
                 <w:szCs w:val="20"/>
               </w:rPr>
@@ -825,7 +783,7 @@
               <w:rPr>
                 <w:b/>
                 <w:bCs/>
-                <w:color w:val="65AADB"/>
+                <w:color w:val="2E7D6B"/>
                 <w:sz w:val="20"/>
                 <w:szCs w:val="20"/>
               </w:rPr>
@@ -909,7 +867,7 @@
               <w:rPr>
                 <w:b/>
                 <w:bCs/>
-                <w:color w:val="65AADB"/>
+                <w:color w:val="2E7D6B"/>
                 <w:sz w:val="20"/>
                 <w:szCs w:val="20"/>
               </w:rPr>
@@ -943,7 +901,7 @@
     <w:p>
       <w:pPr>
         <w:pBdr>
-          <w:bottom w:val="single" w:color="65AADB" w:sz="6" w:space="4"/>
+          <w:bottom w:val="single" w:color="2E7D6B" w:sz="6" w:space="4"/>
         </w:pBdr>
         <w:spacing w:after="150" w:before="300"/>
       </w:pPr>
@@ -952,7 +910,7 @@
           <w:b/>
           <w:bCs/>
           <w:caps/>
-          <w:color w:val="65AADB"/>
+          <w:color w:val="1B2A4E"/>
           <w:sz w:val="26"/>
           <w:szCs w:val="26"/>
         </w:rPr>
@@ -979,7 +937,7 @@
         <w:tc>
           <w:tcPr>
             <w:tcW w:type="dxa" w:w="5800"/>
-            <w:shd w:fill="65AADB" w:color="auto" w:val="clear"/>
+            <w:shd w:fill="1B2A4E" w:color="auto" w:val="clear"/>
             <w:tcMar>
               <w:top w:type="dxa" w:w="80"/>
               <w:left w:type="dxa" w:w="120"/>
@@ -1004,7 +962,7 @@
         <w:tc>
           <w:tcPr>
             <w:tcW w:type="dxa" w:w="3200"/>
-            <w:shd w:fill="65AADB" w:color="auto" w:val="clear"/>
+            <w:shd w:fill="1B2A4E" w:color="auto" w:val="clear"/>
             <w:tcMar>
               <w:top w:type="dxa" w:w="80"/>
               <w:left w:type="dxa" w:w="120"/>
@@ -1318,7 +1276,7 @@
     <w:p>
       <w:pPr>
         <w:pBdr>
-          <w:bottom w:val="single" w:color="65AADB" w:sz="6" w:space="4"/>
+          <w:bottom w:val="single" w:color="2E7D6B" w:sz="6" w:space="4"/>
         </w:pBdr>
         <w:spacing w:after="150" w:before="300"/>
       </w:pPr>
@@ -1327,7 +1285,7 @@
           <w:b/>
           <w:bCs/>
           <w:caps/>
-          <w:color w:val="65AADB"/>
+          <w:color w:val="1B2A4E"/>
           <w:sz w:val="26"/>
           <w:szCs w:val="26"/>
         </w:rPr>
@@ -1342,7 +1300,7 @@
         <w:rPr>
           <w:b/>
           <w:bCs/>
-          <w:color w:val="65AADB"/>
+          <w:color w:val="1B2A4E"/>
           <w:sz w:val="20"/>
           <w:szCs w:val="20"/>
         </w:rPr>
@@ -1369,7 +1327,7 @@
         <w:rPr>
           <w:b/>
           <w:bCs/>
-          <w:color w:val="65AADB"/>
+          <w:color w:val="1B2A4E"/>
           <w:sz w:val="20"/>
           <w:szCs w:val="20"/>
         </w:rPr>
@@ -1396,7 +1354,7 @@
         <w:rPr>
           <w:b/>
           <w:bCs/>
-          <w:color w:val="65AADB"/>
+          <w:color w:val="1B2A4E"/>
           <w:sz w:val="20"/>
           <w:szCs w:val="20"/>
         </w:rPr>
@@ -1423,7 +1381,7 @@
         <w:rPr>
           <w:b/>
           <w:bCs/>
-          <w:color w:val="65AADB"/>
+          <w:color w:val="1B2A4E"/>
           <w:sz w:val="20"/>
           <w:szCs w:val="20"/>
         </w:rPr>
@@ -1450,7 +1408,7 @@
         <w:rPr>
           <w:b/>
           <w:bCs/>
-          <w:color w:val="65AADB"/>
+          <w:color w:val="1B2A4E"/>
           <w:sz w:val="20"/>
           <w:szCs w:val="20"/>
         </w:rPr>
@@ -1477,7 +1435,7 @@
         <w:rPr>
           <w:b/>
           <w:bCs/>
-          <w:color w:val="65AADB"/>
+          <w:color w:val="1B2A4E"/>
           <w:sz w:val="20"/>
           <w:szCs w:val="20"/>
         </w:rPr>
@@ -1504,7 +1462,7 @@
         <w:rPr>
           <w:b/>
           <w:bCs/>
-          <w:color w:val="65AADB"/>
+          <w:color w:val="1B2A4E"/>
           <w:sz w:val="20"/>
           <w:szCs w:val="20"/>
         </w:rPr>
@@ -1531,7 +1489,7 @@
         <w:rPr>
           <w:b/>
           <w:bCs/>
-          <w:color w:val="65AADB"/>
+          <w:color w:val="1B2A4E"/>
           <w:sz w:val="20"/>
           <w:szCs w:val="20"/>
         </w:rPr>
@@ -1558,7 +1516,7 @@
         <w:rPr>
           <w:b/>
           <w:bCs/>
-          <w:color w:val="65AADB"/>
+          <w:color w:val="1B2A4E"/>
           <w:sz w:val="20"/>
           <w:szCs w:val="20"/>
         </w:rPr>
@@ -1585,7 +1543,7 @@
         <w:rPr>
           <w:b/>
           <w:bCs/>
-          <w:color w:val="65AADB"/>
+          <w:color w:val="1B2A4E"/>
           <w:sz w:val="20"/>
           <w:szCs w:val="20"/>
         </w:rPr>
@@ -1612,7 +1570,7 @@
         <w:rPr>
           <w:b/>
           <w:bCs/>
-          <w:color w:val="65AADB"/>
+          <w:color w:val="1B2A4E"/>
           <w:sz w:val="20"/>
           <w:szCs w:val="20"/>
         </w:rPr>
@@ -1655,7 +1613,7 @@
         <w:rPr>
           <w:b/>
           <w:bCs/>
-          <w:color w:val="65AADB"/>
+          <w:color w:val="1B2A4E"/>
         </w:rPr>
         <w:t xml:space="preserve">For BlechTek Software Solutions LLP</w:t>
       </w:r>
@@ -1668,7 +1626,7 @@
         <w:rPr>
           <w:b/>
           <w:bCs/>
-          <w:color w:val="65AADB"/>
+          <w:color w:val="1B2A4E"/>
         </w:rPr>
         <w:t xml:space="preserve">Sushama Inamdar</w:t>
       </w:r>
@@ -1812,7 +1770,7 @@
   <w:p>
     <w:pPr>
       <w:pBdr>
-        <w:bottom w:val="single" w:color="65AADB" w:sz="12" w:space="6"/>
+        <w:bottom w:val="single" w:color="2E7D6B" w:sz="12" w:space="6"/>
       </w:pBdr>
       <w:tabs>
         <w:tab w:val="right" w:pos="9026"/>
@@ -1822,7 +1780,7 @@
       <w:rPr>
         <w:b/>
         <w:bCs/>
-        <w:color w:val="65AADB"/>
+        <w:color w:val="1B2A4E"/>
         <w:sz w:val="24"/>
         <w:szCs w:val="24"/>
       </w:rPr>
@@ -1832,7 +1790,7 @@
       <w:rPr>
         <w:b/>
         <w:bCs/>
-        <w:color w:val="65AADB"/>
+        <w:color w:val="2E7D6B"/>
         <w:sz w:val="20"/>
         <w:szCs w:val="20"/>
       </w:rPr>

</xml_diff>

<commit_message>
update in pdf and word download page
</commit_message>
<xml_diff>
--- a/QuotationApp.API/Templates/QuotationTemplate.docx
+++ b/QuotationApp.API/Templates/QuotationTemplate.docx
@@ -10,7 +10,7 @@
         <w:rPr>
           <w:b/>
           <w:bCs/>
-          <w:color w:val="1B2A4E"/>
+          <w:color w:val="65AADB"/>
         </w:rPr>
         <w:t xml:space="preserve">QUOTATION TO</w:t>
       </w:r>
@@ -23,7 +23,7 @@
         <w:rPr>
           <w:b/>
           <w:bCs/>
-          <w:color w:val="1B2A4E"/>
+          <w:color w:val="65AADB"/>
         </w:rPr>
         <w:t xml:space="preserve">Name: </w:t>
       </w:r>
@@ -31,7 +31,7 @@
         <w:rPr>
           <w:b/>
           <w:bCs/>
-          <w:color w:val="2E7D6B"/>
+          <w:color w:val="65AADB"/>
         </w:rPr>
         <w:t xml:space="preserve">{{CONTACT_NAME}}</w:t>
       </w:r>
@@ -44,7 +44,7 @@
         <w:rPr>
           <w:b/>
           <w:bCs/>
-          <w:color w:val="1B2A4E"/>
+          <w:color w:val="65AADB"/>
         </w:rPr>
         <w:t xml:space="preserve">Address: </w:t>
       </w:r>
@@ -52,7 +52,7 @@
         <w:rPr>
           <w:b/>
           <w:bCs/>
-          <w:color w:val="2E7D6B"/>
+          <w:color w:val="65AADB"/>
         </w:rPr>
         <w:t xml:space="preserve">{{CONTACT_ADDRESS}}</w:t>
       </w:r>
@@ -65,7 +65,7 @@
         <w:rPr>
           <w:b/>
           <w:bCs/>
-          <w:color w:val="1B2A4E"/>
+          <w:color w:val="65AADB"/>
         </w:rPr>
         <w:t xml:space="preserve">Contact No.: </w:t>
       </w:r>
@@ -73,7 +73,7 @@
         <w:rPr>
           <w:b/>
           <w:bCs/>
-          <w:color w:val="2E7D6B"/>
+          <w:color w:val="65AADB"/>
         </w:rPr>
         <w:t xml:space="preserve">{{CONTACT_PHONE}}</w:t>
       </w:r>
@@ -84,7 +84,7 @@
         <w:rPr>
           <w:b/>
           <w:bCs/>
-          <w:color w:val="1B2A4E"/>
+          <w:color w:val="65AADB"/>
         </w:rPr>
         <w:t xml:space="preserve">Email: </w:t>
       </w:r>
@@ -92,7 +92,7 @@
         <w:rPr>
           <w:b/>
           <w:bCs/>
-          <w:color w:val="2E7D6B"/>
+          <w:color w:val="65AADB"/>
         </w:rPr>
         <w:t xml:space="preserve">{{CONTACT_EMAIL}}</w:t>
       </w:r>
@@ -105,7 +105,7 @@
         <w:rPr>
           <w:b/>
           <w:bCs/>
-          <w:color w:val="1B2A4E"/>
+          <w:color w:val="65AADB"/>
         </w:rPr>
         <w:t xml:space="preserve">Reference: </w:t>
       </w:r>
@@ -116,7 +116,7 @@
         <w:rPr>
           <w:b/>
           <w:bCs/>
-          <w:color w:val="2E7D6B"/>
+          <w:color w:val="65AADB"/>
         </w:rPr>
         <w:t xml:space="preserve">{{MODULE_LIST}}</w:t>
       </w:r>
@@ -132,7 +132,7 @@
         <w:rPr>
           <w:b/>
           <w:bCs/>
-          <w:color w:val="1B2A4E"/>
+          <w:color w:val="65AADB"/>
         </w:rPr>
         <w:t xml:space="preserve">Subject: </w:t>
       </w:r>
@@ -143,7 +143,7 @@
         <w:rPr>
           <w:b/>
           <w:bCs/>
-          <w:color w:val="2E7D6B"/>
+          <w:color w:val="65AADB"/>
         </w:rPr>
         <w:t xml:space="preserve">{{MODULE_LIST}}</w:t>
       </w:r>
@@ -178,7 +178,7 @@
         <w:rPr>
           <w:b/>
           <w:bCs/>
-          <w:color w:val="2E7D6B"/>
+          <w:color w:val="65AADB"/>
         </w:rPr>
         <w:t xml:space="preserve">{{ORG_NAME}}</w:t>
       </w:r>
@@ -189,7 +189,7 @@
     <w:p>
       <w:pPr>
         <w:pBdr>
-          <w:bottom w:val="single" w:color="2E7D6B" w:sz="6" w:space="4"/>
+          <w:bottom w:val="single" w:color="65AADB" w:sz="6" w:space="4"/>
         </w:pBdr>
         <w:spacing w:after="150" w:before="300"/>
       </w:pPr>
@@ -198,7 +198,7 @@
           <w:b/>
           <w:bCs/>
           <w:caps/>
-          <w:color w:val="1B2A4E"/>
+          <w:color w:val="65AADB"/>
           <w:sz w:val="26"/>
           <w:szCs w:val="26"/>
         </w:rPr>
@@ -216,7 +216,7 @@
         <w:rPr>
           <w:b/>
           <w:bCs/>
-          <w:color w:val="2E7D6B"/>
+          <w:color w:val="65AADB"/>
         </w:rPr>
         <w:t xml:space="preserve">{{ORG_NAME}}</w:t>
       </w:r>
@@ -235,7 +235,7 @@
         <w:rPr>
           <w:b/>
           <w:bCs/>
-          <w:color w:val="2E7D6B"/>
+          <w:color w:val="65AADB"/>
         </w:rPr>
         <w:t xml:space="preserve">{{MODULE_LIST}}</w:t>
       </w:r>
@@ -246,7 +246,7 @@
     <w:p>
       <w:pPr>
         <w:pBdr>
-          <w:bottom w:val="single" w:color="2E7D6B" w:sz="6" w:space="4"/>
+          <w:bottom w:val="single" w:color="65AADB" w:sz="6" w:space="4"/>
         </w:pBdr>
         <w:spacing w:after="150" w:before="300"/>
       </w:pPr>
@@ -255,7 +255,7 @@
           <w:b/>
           <w:bCs/>
           <w:caps/>
-          <w:color w:val="1B2A4E"/>
+          <w:color w:val="65AADB"/>
           <w:sz w:val="26"/>
           <w:szCs w:val="26"/>
         </w:rPr>
@@ -317,7 +317,7 @@
         <w:rPr>
           <w:b/>
           <w:bCs/>
-          <w:color w:val="2E7D6B"/>
+          <w:color w:val="65AADB"/>
         </w:rPr>
         <w:t xml:space="preserve">{{MODULE_LIST}}</w:t>
       </w:r>
@@ -333,7 +333,7 @@
     <w:p>
       <w:pPr>
         <w:pBdr>
-          <w:bottom w:val="single" w:color="2E7D6B" w:sz="6" w:space="4"/>
+          <w:bottom w:val="single" w:color="65AADB" w:sz="6" w:space="4"/>
         </w:pBdr>
         <w:spacing w:after="150" w:before="300"/>
       </w:pPr>
@@ -342,7 +342,7 @@
           <w:b/>
           <w:bCs/>
           <w:caps/>
-          <w:color w:val="1B2A4E"/>
+          <w:color w:val="65AADB"/>
           <w:sz w:val="26"/>
           <w:szCs w:val="26"/>
         </w:rPr>
@@ -374,7 +374,7 @@
         <w:tc>
           <w:tcPr>
             <w:tcW w:type="dxa" w:w="2200"/>
-            <w:shd w:fill="1B2A4E" w:color="auto" w:val="clear"/>
+            <w:shd w:fill="65AADB" w:color="auto" w:val="clear"/>
             <w:tcMar>
               <w:top w:type="dxa" w:w="80"/>
               <w:left w:type="dxa" w:w="120"/>
@@ -399,7 +399,7 @@
         <w:tc>
           <w:tcPr>
             <w:tcW w:type="dxa" w:w="5200"/>
-            <w:shd w:fill="1B2A4E" w:color="auto" w:val="clear"/>
+            <w:shd w:fill="65AADB" w:color="auto" w:val="clear"/>
             <w:tcMar>
               <w:top w:type="dxa" w:w="80"/>
               <w:left w:type="dxa" w:w="120"/>
@@ -424,7 +424,7 @@
         <w:tc>
           <w:tcPr>
             <w:tcW w:type="dxa" w:w="1600"/>
-            <w:shd w:fill="1B2A4E" w:color="auto" w:val="clear"/>
+            <w:shd w:fill="65AADB" w:color="auto" w:val="clear"/>
             <w:tcMar>
               <w:top w:type="dxa" w:w="80"/>
               <w:left w:type="dxa" w:w="120"/>
@@ -449,7 +449,7 @@
         <w:tc>
           <w:tcPr>
             <w:tcW w:type="dxa" w:w="1"/>
-            <w:shd w:fill="1B2A4E" w:color="auto" w:val="clear"/>
+            <w:shd w:fill="65AADB" w:color="auto" w:val="clear"/>
             <w:tcMar>
               <w:top w:type="dxa" w:w="80"/>
               <w:left w:type="dxa" w:w="120"/>
@@ -531,7 +531,7 @@
               <w:rPr>
                 <w:b/>
                 <w:bCs/>
-                <w:color w:val="2E7D6B"/>
+                <w:color w:val="65AADB"/>
                 <w:sz w:val="20"/>
                 <w:szCs w:val="20"/>
               </w:rPr>
@@ -615,7 +615,7 @@
               <w:rPr>
                 <w:b/>
                 <w:bCs/>
-                <w:color w:val="2E7D6B"/>
+                <w:color w:val="65AADB"/>
                 <w:sz w:val="20"/>
                 <w:szCs w:val="20"/>
               </w:rPr>
@@ -699,7 +699,7 @@
               <w:rPr>
                 <w:b/>
                 <w:bCs/>
-                <w:color w:val="2E7D6B"/>
+                <w:color w:val="65AADB"/>
                 <w:sz w:val="20"/>
                 <w:szCs w:val="20"/>
               </w:rPr>
@@ -783,7 +783,7 @@
               <w:rPr>
                 <w:b/>
                 <w:bCs/>
-                <w:color w:val="2E7D6B"/>
+                <w:color w:val="65AADB"/>
                 <w:sz w:val="20"/>
                 <w:szCs w:val="20"/>
               </w:rPr>
@@ -867,7 +867,7 @@
               <w:rPr>
                 <w:b/>
                 <w:bCs/>
-                <w:color w:val="2E7D6B"/>
+                <w:color w:val="65AADB"/>
                 <w:sz w:val="20"/>
                 <w:szCs w:val="20"/>
               </w:rPr>
@@ -901,7 +901,7 @@
     <w:p>
       <w:pPr>
         <w:pBdr>
-          <w:bottom w:val="single" w:color="2E7D6B" w:sz="6" w:space="4"/>
+          <w:bottom w:val="single" w:color="65AADB" w:sz="6" w:space="4"/>
         </w:pBdr>
         <w:spacing w:after="150" w:before="300"/>
       </w:pPr>
@@ -910,7 +910,7 @@
           <w:b/>
           <w:bCs/>
           <w:caps/>
-          <w:color w:val="1B2A4E"/>
+          <w:color w:val="65AADB"/>
           <w:sz w:val="26"/>
           <w:szCs w:val="26"/>
         </w:rPr>
@@ -937,7 +937,7 @@
         <w:tc>
           <w:tcPr>
             <w:tcW w:type="dxa" w:w="5800"/>
-            <w:shd w:fill="1B2A4E" w:color="auto" w:val="clear"/>
+            <w:shd w:fill="65AADB" w:color="auto" w:val="clear"/>
             <w:tcMar>
               <w:top w:type="dxa" w:w="80"/>
               <w:left w:type="dxa" w:w="120"/>
@@ -962,7 +962,7 @@
         <w:tc>
           <w:tcPr>
             <w:tcW w:type="dxa" w:w="3200"/>
-            <w:shd w:fill="1B2A4E" w:color="auto" w:val="clear"/>
+            <w:shd w:fill="65AADB" w:color="auto" w:val="clear"/>
             <w:tcMar>
               <w:top w:type="dxa" w:w="80"/>
               <w:left w:type="dxa" w:w="120"/>
@@ -1276,7 +1276,7 @@
     <w:p>
       <w:pPr>
         <w:pBdr>
-          <w:bottom w:val="single" w:color="2E7D6B" w:sz="6" w:space="4"/>
+          <w:bottom w:val="single" w:color="65AADB" w:sz="6" w:space="4"/>
         </w:pBdr>
         <w:spacing w:after="150" w:before="300"/>
       </w:pPr>
@@ -1285,7 +1285,7 @@
           <w:b/>
           <w:bCs/>
           <w:caps/>
-          <w:color w:val="1B2A4E"/>
+          <w:color w:val="65AADB"/>
           <w:sz w:val="26"/>
           <w:szCs w:val="26"/>
         </w:rPr>
@@ -1300,7 +1300,7 @@
         <w:rPr>
           <w:b/>
           <w:bCs/>
-          <w:color w:val="1B2A4E"/>
+          <w:color w:val="65AADB"/>
           <w:sz w:val="20"/>
           <w:szCs w:val="20"/>
         </w:rPr>
@@ -1327,7 +1327,7 @@
         <w:rPr>
           <w:b/>
           <w:bCs/>
-          <w:color w:val="1B2A4E"/>
+          <w:color w:val="65AADB"/>
           <w:sz w:val="20"/>
           <w:szCs w:val="20"/>
         </w:rPr>
@@ -1354,7 +1354,7 @@
         <w:rPr>
           <w:b/>
           <w:bCs/>
-          <w:color w:val="1B2A4E"/>
+          <w:color w:val="65AADB"/>
           <w:sz w:val="20"/>
           <w:szCs w:val="20"/>
         </w:rPr>
@@ -1381,7 +1381,7 @@
         <w:rPr>
           <w:b/>
           <w:bCs/>
-          <w:color w:val="1B2A4E"/>
+          <w:color w:val="65AADB"/>
           <w:sz w:val="20"/>
           <w:szCs w:val="20"/>
         </w:rPr>
@@ -1408,7 +1408,7 @@
         <w:rPr>
           <w:b/>
           <w:bCs/>
-          <w:color w:val="1B2A4E"/>
+          <w:color w:val="65AADB"/>
           <w:sz w:val="20"/>
           <w:szCs w:val="20"/>
         </w:rPr>
@@ -1435,7 +1435,7 @@
         <w:rPr>
           <w:b/>
           <w:bCs/>
-          <w:color w:val="1B2A4E"/>
+          <w:color w:val="65AADB"/>
           <w:sz w:val="20"/>
           <w:szCs w:val="20"/>
         </w:rPr>
@@ -1462,7 +1462,7 @@
         <w:rPr>
           <w:b/>
           <w:bCs/>
-          <w:color w:val="1B2A4E"/>
+          <w:color w:val="65AADB"/>
           <w:sz w:val="20"/>
           <w:szCs w:val="20"/>
         </w:rPr>
@@ -1489,7 +1489,7 @@
         <w:rPr>
           <w:b/>
           <w:bCs/>
-          <w:color w:val="1B2A4E"/>
+          <w:color w:val="65AADB"/>
           <w:sz w:val="20"/>
           <w:szCs w:val="20"/>
         </w:rPr>
@@ -1516,7 +1516,7 @@
         <w:rPr>
           <w:b/>
           <w:bCs/>
-          <w:color w:val="1B2A4E"/>
+          <w:color w:val="65AADB"/>
           <w:sz w:val="20"/>
           <w:szCs w:val="20"/>
         </w:rPr>
@@ -1543,7 +1543,7 @@
         <w:rPr>
           <w:b/>
           <w:bCs/>
-          <w:color w:val="1B2A4E"/>
+          <w:color w:val="65AADB"/>
           <w:sz w:val="20"/>
           <w:szCs w:val="20"/>
         </w:rPr>
@@ -1570,7 +1570,7 @@
         <w:rPr>
           <w:b/>
           <w:bCs/>
-          <w:color w:val="1B2A4E"/>
+          <w:color w:val="65AADB"/>
           <w:sz w:val="20"/>
           <w:szCs w:val="20"/>
         </w:rPr>
@@ -1613,7 +1613,7 @@
         <w:rPr>
           <w:b/>
           <w:bCs/>
-          <w:color w:val="1B2A4E"/>
+          <w:color w:val="65AADB"/>
         </w:rPr>
         <w:t xml:space="preserve">For BlechTek Software Solutions LLP</w:t>
       </w:r>
@@ -1626,7 +1626,7 @@
         <w:rPr>
           <w:b/>
           <w:bCs/>
-          <w:color w:val="1B2A4E"/>
+          <w:color w:val="65AADB"/>
         </w:rPr>
         <w:t xml:space="preserve">Sushama Inamdar</w:t>
       </w:r>
@@ -1770,7 +1770,7 @@
   <w:p>
     <w:pPr>
       <w:pBdr>
-        <w:bottom w:val="single" w:color="2E7D6B" w:sz="12" w:space="6"/>
+        <w:bottom w:val="single" w:color="65AADB" w:sz="12" w:space="6"/>
       </w:pBdr>
       <w:tabs>
         <w:tab w:val="right" w:pos="9026"/>
@@ -1780,7 +1780,7 @@
       <w:rPr>
         <w:b/>
         <w:bCs/>
-        <w:color w:val="1B2A4E"/>
+        <w:color w:val="65AADB"/>
         <w:sz w:val="24"/>
         <w:szCs w:val="24"/>
       </w:rPr>
@@ -1790,7 +1790,7 @@
       <w:rPr>
         <w:b/>
         <w:bCs/>
-        <w:color w:val="2E7D6B"/>
+        <w:color w:val="65AADB"/>
         <w:sz w:val="20"/>
         <w:szCs w:val="20"/>
       </w:rPr>

</xml_diff>